<commit_message>
Add Markdown versions of the documentation
docs/make_docs.py now writes every document both as Word (.docx) and as
GitHub flavoured Markdown (.md) from the same content, so the formats stay
in sync. The README links both versions.

Co-Authored-By: Claude Opus 5.5 <noreply@anthropic.com>
</commit_message>
<xml_diff>
--- a/docs/TrademarkImage_Technical_Documentation_EN.docx
+++ b/docs/TrademarkImage_Technical_Documentation_EN.docx
@@ -2674,6 +2674,11 @@
       </w:r>
     </w:p>
     <w:p>
+      <w:r>
+        <w:t>Both documents are generated by docs\make_docs.py from a single source, in Word (.docx) and Markdown (.md) format, so the two formats always have the same content. Edit the texts there, not in the generated files.</w:t>
+      </w:r>
+    </w:p>
+    <w:p>
       <w:pPr>
         <w:spacing w:after="0"/>
         <w:ind w:left="360"/>

</xml_diff>